<commit_message>
Update Dagbok.docx with design decisions and plans for the database
</commit_message>
<xml_diff>
--- a/Dagbok.docx
+++ b/Dagbok.docx
@@ -2,7 +2,36 @@
 <file path=word/document.xml><?xml version="1.0" encoding="utf-8"?>
 <w:document xmlns:wpc="http://schemas.microsoft.com/office/word/2010/wordprocessingCanvas" xmlns:cx="http://schemas.microsoft.com/office/drawing/2014/chartex" xmlns:cx1="http://schemas.microsoft.com/office/drawing/2015/9/8/chartex" xmlns:cx2="http://schemas.microsoft.com/office/drawing/2015/10/21/chartex" xmlns:cx3="http://schemas.microsoft.com/office/drawing/2016/5/9/chartex" xmlns:cx4="http://schemas.microsoft.com/office/drawing/2016/5/10/chartex" xmlns:cx5="http://schemas.microsoft.com/office/drawing/2016/5/11/chartex" xmlns:cx6="http://schemas.microsoft.com/office/drawing/2016/5/12/chartex" xmlns:cx7="http://schemas.microsoft.com/office/drawing/2016/5/13/chartex" xmlns:cx8="http://schemas.microsoft.com/office/drawing/2016/5/14/chartex" xmlns:mc="http://schemas.openxmlformats.org/markup-compatibility/2006" xmlns:aink="http://schemas.microsoft.com/office/drawing/2016/ink" xmlns:am3d="http://schemas.microsoft.com/office/drawing/2017/model3d" xmlns:o="urn:schemas-microsoft-com:office:office" xmlns:oel="http://schemas.microsoft.com/office/2019/extlst" xmlns:r="http://schemas.openxmlformats.org/officeDocument/2006/relationships" xmlns:m="http://schemas.openxmlformats.org/officeDocument/2006/math" xmlns:v="urn:schemas-microsoft-com:vml" xmlns:wp14="http://schemas.microsoft.com/office/word/2010/wordprocessingDrawing" xmlns:wp="http://schemas.openxmlformats.org/drawingml/2006/wordprocessingDrawing" xmlns:w10="urn:schemas-microsoft-com:office:word" xmlns:w="http://schemas.openxmlformats.org/wordprocessingml/2006/main" xmlns:w14="http://schemas.microsoft.com/office/word/2010/wordml" xmlns:w15="http://schemas.microsoft.com/office/word/2012/wordml" xmlns:w16cex="http://schemas.microsoft.com/office/word/2018/wordml/cex" xmlns:w16cid="http://schemas.microsoft.com/office/word/2016/wordml/cid" xmlns:w16="http://schemas.microsoft.com/office/word/2018/wordml" xmlns:w16sdtdh="http://schemas.microsoft.com/office/word/2020/wordml/sdtdatahash" xmlns:w16se="http://schemas.microsoft.com/office/word/2015/wordml/symex" xmlns:wpg="http://schemas.microsoft.com/office/word/2010/wordprocessingGroup" xmlns:wpi="http://schemas.microsoft.com/office/word/2010/wordprocessingInk" xmlns:wne="http://schemas.microsoft.com/office/word/2006/wordml" xmlns:wps="http://schemas.microsoft.com/office/word/2010/wordprocessingShape" mc:Ignorable="w14 w15 w16se w16cid w16 w16cex w16sdtdh wp14">
   <w:body>
-    <w:p/>
+    <w:p>
+      <w:r>
+        <w:t>Design beslut:</w:t>
+      </w:r>
+      <w:r>
+        <w:br/>
+      </w:r>
+      <w:r>
+        <w:t xml:space="preserve">Jag började med att skapa ett konceptuellt diagram till kunden, jag valde att ta med tabeller för att ta bort många-till-många relationer mellan tabeller. Jag började tänka väldigt stort med databasen och affärsidé kunden vill att jag ska jobba med att användare ska kunna boka hemsökta platser, företaget ska även leverera olika events tema som har något med skräck att göra, kan vara ett zombie-maraton eller en skräckupplevelse med övernattning på ett hemsökt slott. Efter det konceptuella diagrammet började jag att bygga på det fysiska diagrammet med en rimlig </w:t>
+      </w:r>
+      <w:proofErr w:type="spellStart"/>
+      <w:r>
+        <w:t>kardinalitet</w:t>
+      </w:r>
+      <w:proofErr w:type="spellEnd"/>
+      <w:r>
+        <w:t xml:space="preserve">, bryggtabeller som tar bort många-till-många relationer. Jag har tagit med longitud och latitud och företaget kommer vara verksam i olika länder i Europa, min tanke är där att kunna presentera visuella diagram i </w:t>
+      </w:r>
+      <w:proofErr w:type="spellStart"/>
+      <w:r>
+        <w:t>dashbords</w:t>
+      </w:r>
+      <w:proofErr w:type="spellEnd"/>
+      <w:r>
+        <w:t xml:space="preserve"> med geografiska kartor men självklart ska jag ta mig en närmare titt på frågorna jag har för att kunna ställa för att få svar på den visuella aspekten</w:t>
+      </w:r>
+      <w:r>
+        <w:t>, jag vill gärna se om jag kan få svar på frågorna innan jag börjar med att lägga in dataposter i databasen samt att börja med data visualiseringen.</w:t>
+      </w:r>
+    </w:p>
     <w:sectPr>
       <w:pgSz w:w="11906" w:h="16838"/>
       <w:pgMar w:top="1417" w:right="1417" w:bottom="1417" w:left="1417" w:header="708" w:footer="708" w:gutter="0"/>

</xml_diff>

<commit_message>
Update Dagbok.docx with revised design decisions and plans for the database
</commit_message>
<xml_diff>
--- a/Dagbok.docx
+++ b/Dagbok.docx
@@ -10,23 +10,37 @@
         <w:br/>
       </w:r>
       <w:r>
-        <w:t xml:space="preserve">Jag började med att skapa ett konceptuellt diagram till kunden, jag valde att ta med tabeller för att ta bort många-till-många relationer mellan tabeller. Jag började tänka väldigt stort med databasen och affärsidé kunden vill att jag ska jobba med att användare ska kunna boka hemsökta platser, företaget ska även leverera olika events tema som har något med skräck att göra, kan vara ett zombie-maraton eller en skräckupplevelse med övernattning på ett hemsökt slott. Efter det konceptuella diagrammet började jag att bygga på det fysiska diagrammet med en rimlig </w:t>
-      </w:r>
-      <w:proofErr w:type="spellStart"/>
-      <w:r>
-        <w:t>kardinalitet</w:t>
-      </w:r>
-      <w:proofErr w:type="spellEnd"/>
-      <w:r>
-        <w:t xml:space="preserve">, bryggtabeller som tar bort många-till-många relationer. Jag har tagit med longitud och latitud och företaget kommer vara verksam i olika länder i Europa, min tanke är där att kunna presentera visuella diagram i </w:t>
-      </w:r>
-      <w:proofErr w:type="spellStart"/>
-      <w:r>
-        <w:t>dashbords</w:t>
-      </w:r>
-      <w:proofErr w:type="spellEnd"/>
-      <w:r>
-        <w:t xml:space="preserve"> med geografiska kartor men självklart ska jag ta mig en närmare titt på frågorna jag har för att kunna ställa för att få svar på den visuella aspekten</w:t>
+        <w:t>Jag började med att skapa ett konceptuellt diagram till kunden, jag valde att ta med tabeller för att ta bort många-till-många relationer mellan tabeller</w:t>
+      </w:r>
+      <w:r>
+        <w:t xml:space="preserve"> i det konceptuella diagrammet</w:t>
+      </w:r>
+      <w:r>
+        <w:t xml:space="preserve">. Jag började tänka </w:t>
+      </w:r>
+      <w:r>
+        <w:t>vad jag ska ha för</w:t>
+      </w:r>
+      <w:r>
+        <w:t xml:space="preserve"> databas och affärsidé</w:t>
+      </w:r>
+      <w:r>
+        <w:t>n</w:t>
+      </w:r>
+      <w:r>
+        <w:t xml:space="preserve"> kunden vill att jag ska jobba med att användare ska kunna boka hemsökta platser, företaget ska även leverera olika events tema som har något med </w:t>
+      </w:r>
+      <w:r>
+        <w:t>skräcktema att</w:t>
+      </w:r>
+      <w:r>
+        <w:t xml:space="preserve"> göra, kan vara ett zombie-maraton eller en skräckupplevelse med övernattning på ett hemsökt slott. Efter det konceptuella diagrammet började jag att bygga på det fysiska diagrammet med en rimlig kardinalitet, bryggtabeller som tar bort många-till-många relationer. </w:t>
+      </w:r>
+      <w:r>
+        <w:t xml:space="preserve">Mina kunder är User, order tabellen kan jämföras med bokning tabellen i mitt ERD-diagram, mina produkter är hemsökta platser och events, och leverantörer är samarbetspartners och eventuellt ska jag ta med marknadsföringar som leverantörer. </w:t>
+      </w:r>
+      <w:r>
+        <w:t>Jag har tagit med longitud och latitud och företaget kommer vara verksam i olika länder i Europa, min tanke är där att kunna presentera visuella diagram i dashbords med geografiska kartor men självklart ska jag ta mig en närmare titt på frågorna jag har för att kunna ställa för att få svar på den visuella aspekten</w:t>
       </w:r>
       <w:r>
         <w:t>, jag vill gärna se om jag kan få svar på frågorna innan jag börjar med att lägga in dataposter i databasen samt att börja med data visualiseringen.</w:t>

</xml_diff>